<commit_message>
chore(templates): update contract templates and forms (#568)
Routine refresh of contract template and external-form artifacts and catalog metadata. Contributions are welcome — open an issue or pull request and we'll fold it in.

Co-authored-by: OpenAgreements <noreply@openagreements.org>
</commit_message>
<xml_diff>
--- a/templates/openagreements-cc-by-4.0/openagreements-due-diligence-request-list/template.docx
+++ b/templates/openagreements-cc-by-4.0/openagreements-due-diligence-request-list/template.docx
@@ -2115,85 +2115,20 @@
           <w:b/>
           <w:bCs/>
         </w:rPr>
-        <w:t xml:space="preserve">Section O — Tech / SaaS Rider</w:t>
-      </w:r>
-    </w:p>
-    <w:p>
-      <w:pPr>
-        <w:pStyle w:val="OABody"/>
-        <w:numPr>
-          <w:ilvl w:val="1"/>
-          <w:numId w:val="1"/>
-        </w:numPr>
-        <w:spacing w:before="0" w:after="120" w:line="340" w:lineRule="auto"/>
-      </w:pPr>
-      <w:r>
-        <w:t xml:space="preserve">The following requests apply only if the target operates a software, SaaS, platform, marketplace, or data-heavy business.</w:t>
-      </w:r>
-    </w:p>
-    <w:p>
-      <w:pPr>
-        <w:pStyle w:val="OABody"/>
-        <w:numPr>
-          <w:ilvl w:val="1"/>
-          <w:numId w:val="1"/>
-        </w:numPr>
-        <w:spacing w:before="0" w:after="120" w:line="340" w:lineRule="auto"/>
-      </w:pPr>
-      <w:r>
-        <w:t xml:space="preserve">O.1 Complete open-source-software (OSS) inventory by component, with the license governing each component, whether each component is statically linked, dynamically linked, or used as a service, and whether the resulting product is distributed externally. Include any output from automated OSS-scan tools (e.g., Black Duck, FOSSA, Snyk).</w:t>
-      </w:r>
-    </w:p>
-    <w:p>
-      <w:pPr>
-        <w:pStyle w:val="OABody"/>
-        <w:numPr>
-          <w:ilvl w:val="1"/>
-          <w:numId w:val="1"/>
-        </w:numPr>
-        <w:spacing w:before="0" w:after="120" w:line="340" w:lineRule="auto"/>
-      </w:pPr>
-      <w:r>
-        <w:t xml:space="preserve">O.2 OSS-policy documentation including approval workflows, copyleft / viral-license screening procedures, and any prior OSS license violations or remediation actions.</w:t>
-      </w:r>
-    </w:p>
-    <w:p>
-      <w:pPr>
-        <w:pStyle w:val="OABody"/>
-        <w:numPr>
-          <w:ilvl w:val="1"/>
-          <w:numId w:val="1"/>
-        </w:numPr>
-        <w:spacing w:before="0" w:after="120" w:line="340" w:lineRule="auto"/>
-      </w:pPr>
-      <w:r>
-        <w:t xml:space="preserve">O.3 Source-code escrow arrangements with customers or escrow agents, including triggers, release conditions, and current escrow contents.</w:t>
-      </w:r>
-    </w:p>
-    <w:p>
-      <w:pPr>
-        <w:pStyle w:val="OABody"/>
-        <w:numPr>
-          <w:ilvl w:val="1"/>
-          <w:numId w:val="1"/>
-        </w:numPr>
-        <w:spacing w:before="0" w:after="120" w:line="340" w:lineRule="auto"/>
-      </w:pPr>
-      <w:r>
-        <w:t xml:space="preserve">O.4 All material hosted-services and IT agreements (cloud hosting, CDN, monitoring, observability, identity, payments), with change-of-control / assignment provisions identified.</w:t>
-      </w:r>
-    </w:p>
-    <w:p>
-      <w:pPr>
-        <w:pStyle w:val="OABody"/>
-        <w:numPr>
-          <w:ilvl w:val="1"/>
-          <w:numId w:val="1"/>
-        </w:numPr>
-        <w:spacing w:before="0" w:after="120" w:line="340" w:lineRule="auto"/>
-      </w:pPr>
-      <w:r>
-        <w:t xml:space="preserve">O.5 Most recent SOC 2 Type II report and ISO 27001 audit results, plus any internal vulnerability scan or penetration test reports for the past </w:t>
+        <w:t xml:space="preserve">Section O — Environmental</w:t>
+      </w:r>
+    </w:p>
+    <w:p>
+      <w:pPr>
+        <w:pStyle w:val="OABody"/>
+        <w:numPr>
+          <w:ilvl w:val="1"/>
+          <w:numId w:val="1"/>
+        </w:numPr>
+        <w:spacing w:before="0" w:after="120" w:line="340" w:lineRule="auto"/>
+      </w:pPr>
+      <w:r>
+        <w:t xml:space="preserve">O.1 Environmental permits, registrations, and authorizations, and any notices of violation or noncompliance within the past </w:t>
       </w:r>
       <w:r>
         <w:rPr>
@@ -2216,33 +2151,143 @@
         <w:spacing w:before="0" w:after="120" w:line="340" w:lineRule="auto"/>
       </w:pPr>
       <w:r>
-        <w:t xml:space="preserve">O.6 Data-flow architecture diagrams showing how customer data moves through the target's systems and sub-processors.</w:t>
-      </w:r>
-    </w:p>
-    <w:p>
-      <w:pPr>
-        <w:pStyle w:val="OABody"/>
-        <w:numPr>
-          <w:ilvl w:val="1"/>
-          <w:numId w:val="1"/>
-        </w:numPr>
-        <w:spacing w:before="0" w:after="120" w:line="340" w:lineRule="auto"/>
-      </w:pPr>
-      <w:r>
-        <w:t xml:space="preserve">O.7 Customer-facing Service Level Agreements (SLAs), including uptime commitments and credit / refund mechanics for SLA breaches.</w:t>
-      </w:r>
-    </w:p>
-    <w:p>
-      <w:pPr>
-        <w:pStyle w:val="OABody"/>
-        <w:numPr>
-          <w:ilvl w:val="1"/>
-          <w:numId w:val="1"/>
-        </w:numPr>
-        <w:spacing w:before="0" w:after="120" w:line="340" w:lineRule="auto"/>
-      </w:pPr>
-      <w:r>
-        <w:t xml:space="preserve">O.8 Security-incident history for the past </w:t>
+        <w:t xml:space="preserve">O.2 Phase I and Phase II environmental site assessments and any environmental audit reports for owned or leased real property.</w:t>
+      </w:r>
+    </w:p>
+    <w:p>
+      <w:pPr>
+        <w:pStyle w:val="OABody"/>
+        <w:numPr>
+          <w:ilvl w:val="1"/>
+          <w:numId w:val="1"/>
+        </w:numPr>
+        <w:spacing w:before="0" w:after="120" w:line="340" w:lineRule="auto"/>
+      </w:pPr>
+      <w:r>
+        <w:t xml:space="preserve">O.3 Correspondence with the EPA or state environmental agencies regarding investigations, remediation, or alleged liability, regardless of date.</w:t>
+      </w:r>
+    </w:p>
+    <w:p>
+      <w:pPr>
+        <w:pStyle w:val="OABody"/>
+        <w:numPr>
+          <w:ilvl w:val="1"/>
+          <w:numId w:val="1"/>
+        </w:numPr>
+        <w:spacing w:before="0" w:after="120" w:line="340" w:lineRule="auto"/>
+      </w:pPr>
+      <w:r>
+        <w:t xml:space="preserve">O.4 Records of hazardous-materials use, storage, or disposal, and any CERCLA, RCRA, or analogous state-law liabilities, potentially-responsible-party (PRP) notices, or remediation obligations.</w:t>
+      </w:r>
+    </w:p>
+    <w:p>
+      <w:pPr>
+        <w:pStyle w:val="OABody"/>
+        <w:numPr>
+          <w:ilvl w:val="1"/>
+          <w:numId w:val="1"/>
+        </w:numPr>
+        <w:spacing w:before="0" w:after="120" w:line="340" w:lineRule="auto"/>
+      </w:pPr>
+      <w:r>
+        <w:t xml:space="preserve">O.5 For cloud-native or asset-light targets that own or lease no operating facilities, a written confirmation that the target has no material environmental operations or liabilities in lieu of the foregoing.</w:t>
+      </w:r>
+    </w:p>
+    <w:p>
+      <w:pPr>
+        <w:pStyle w:val="OABody"/>
+        <w:keepNext/>
+        <w:numPr>
+          <w:ilvl w:val="0"/>
+          <w:numId w:val="1"/>
+        </w:numPr>
+        <w:spacing w:before="320" w:after="120" w:line="340" w:lineRule="auto"/>
+        <w:jc w:val="left"/>
+      </w:pPr>
+      <w:r>
+        <w:rPr>
+          <w:b/>
+          <w:bCs/>
+        </w:rPr>
+        <w:t xml:space="preserve">Section P — Tech / SaaS Rider</w:t>
+      </w:r>
+    </w:p>
+    <w:p>
+      <w:pPr>
+        <w:pStyle w:val="OABody"/>
+        <w:numPr>
+          <w:ilvl w:val="1"/>
+          <w:numId w:val="1"/>
+        </w:numPr>
+        <w:spacing w:before="0" w:after="120" w:line="340" w:lineRule="auto"/>
+      </w:pPr>
+      <w:r>
+        <w:t xml:space="preserve">The following requests apply only if the target operates a software, SaaS, platform, marketplace, or data-heavy business.</w:t>
+      </w:r>
+    </w:p>
+    <w:p>
+      <w:pPr>
+        <w:pStyle w:val="OABody"/>
+        <w:numPr>
+          <w:ilvl w:val="1"/>
+          <w:numId w:val="1"/>
+        </w:numPr>
+        <w:spacing w:before="0" w:after="120" w:line="340" w:lineRule="auto"/>
+      </w:pPr>
+      <w:r>
+        <w:t xml:space="preserve">P.1 Complete open-source-software (OSS) inventory by component, with the license governing each component, whether each component is statically linked, dynamically linked, or used as a service, and whether the resulting product is distributed externally. Include any output from automated OSS-scan tools (e.g., Black Duck, FOSSA, Snyk).</w:t>
+      </w:r>
+    </w:p>
+    <w:p>
+      <w:pPr>
+        <w:pStyle w:val="OABody"/>
+        <w:numPr>
+          <w:ilvl w:val="1"/>
+          <w:numId w:val="1"/>
+        </w:numPr>
+        <w:spacing w:before="0" w:after="120" w:line="340" w:lineRule="auto"/>
+      </w:pPr>
+      <w:r>
+        <w:t xml:space="preserve">P.2 OSS-policy documentation including approval workflows, copyleft / viral-license screening procedures, and any prior OSS license violations or remediation actions.</w:t>
+      </w:r>
+    </w:p>
+    <w:p>
+      <w:pPr>
+        <w:pStyle w:val="OABody"/>
+        <w:numPr>
+          <w:ilvl w:val="1"/>
+          <w:numId w:val="1"/>
+        </w:numPr>
+        <w:spacing w:before="0" w:after="120" w:line="340" w:lineRule="auto"/>
+      </w:pPr>
+      <w:r>
+        <w:t xml:space="preserve">P.3 Source-code escrow arrangements with customers or escrow agents, including triggers, release conditions, and current escrow contents.</w:t>
+      </w:r>
+    </w:p>
+    <w:p>
+      <w:pPr>
+        <w:pStyle w:val="OABody"/>
+        <w:numPr>
+          <w:ilvl w:val="1"/>
+          <w:numId w:val="1"/>
+        </w:numPr>
+        <w:spacing w:before="0" w:after="120" w:line="340" w:lineRule="auto"/>
+      </w:pPr>
+      <w:r>
+        <w:t xml:space="preserve">P.4 All material hosted-services and IT agreements (cloud hosting, CDN, monitoring, observability, identity, payments), with change-of-control / assignment provisions identified.</w:t>
+      </w:r>
+    </w:p>
+    <w:p>
+      <w:pPr>
+        <w:pStyle w:val="OABody"/>
+        <w:numPr>
+          <w:ilvl w:val="1"/>
+          <w:numId w:val="1"/>
+        </w:numPr>
+        <w:spacing w:before="0" w:after="120" w:line="340" w:lineRule="auto"/>
+      </w:pPr>
+      <w:r>
+        <w:t xml:space="preserve">P.5 Most recent SOC 2 Type II report and ISO 27001 audit results, plus any internal vulnerability scan or penetration test reports for the past </w:t>
       </w:r>
       <w:r>
         <w:rPr>
@@ -2252,6 +2297,55 @@
         <w:t xml:space="preserve">3</w:t>
       </w:r>
       <w:r>
+        <w:t xml:space="preserve"> years.</w:t>
+      </w:r>
+    </w:p>
+    <w:p>
+      <w:pPr>
+        <w:pStyle w:val="OABody"/>
+        <w:numPr>
+          <w:ilvl w:val="1"/>
+          <w:numId w:val="1"/>
+        </w:numPr>
+        <w:spacing w:before="0" w:after="120" w:line="340" w:lineRule="auto"/>
+      </w:pPr>
+      <w:r>
+        <w:t xml:space="preserve">P.6 Data-flow architecture diagrams showing how customer data moves through the target's systems and sub-processors.</w:t>
+      </w:r>
+    </w:p>
+    <w:p>
+      <w:pPr>
+        <w:pStyle w:val="OABody"/>
+        <w:numPr>
+          <w:ilvl w:val="1"/>
+          <w:numId w:val="1"/>
+        </w:numPr>
+        <w:spacing w:before="0" w:after="120" w:line="340" w:lineRule="auto"/>
+      </w:pPr>
+      <w:r>
+        <w:t xml:space="preserve">P.7 Customer-facing Service Level Agreements (SLAs), including uptime commitments and credit / refund mechanics for SLA breaches.</w:t>
+      </w:r>
+    </w:p>
+    <w:p>
+      <w:pPr>
+        <w:pStyle w:val="OABody"/>
+        <w:numPr>
+          <w:ilvl w:val="1"/>
+          <w:numId w:val="1"/>
+        </w:numPr>
+        <w:spacing w:before="0" w:after="120" w:line="340" w:lineRule="auto"/>
+      </w:pPr>
+      <w:r>
+        <w:t xml:space="preserve">P.8 Security-incident history for the past </w:t>
+      </w:r>
+      <w:r>
+        <w:rPr>
+          <w:b w:val="0"/>
+          <w:bCs w:val="0"/>
+        </w:rPr>
+        <w:t xml:space="preserve">3</w:t>
+      </w:r>
+      <w:r>
         <w:t xml:space="preserve"> years (cross-reference Section I.4 for breaches with regulatory reporting obligations).</w:t>
       </w:r>
     </w:p>
@@ -2265,7 +2359,7 @@
         <w:spacing w:before="0" w:after="120" w:line="340" w:lineRule="auto"/>
       </w:pPr>
       <w:r>
-        <w:t xml:space="preserve">O.9 GDPR / CCPA / cross-border data-transfer mechanisms (Standard Contractual Clauses, adequacy decisions, BCRs) where applicable.</w:t>
+        <w:t xml:space="preserve">P.9 GDPR / CCPA / cross-border data-transfer mechanisms (Standard Contractual Clauses, adequacy decisions, BCRs) where applicable.</w:t>
       </w:r>
     </w:p>
     <w:p>
@@ -2284,7 +2378,7 @@
           <w:b/>
           <w:bCs/>
         </w:rPr>
-        <w:t xml:space="preserve">Section P — Life Sciences Rider</w:t>
+        <w:t xml:space="preserve">Section Q — Life Sciences Rider</w:t>
       </w:r>
     </w:p>
     <w:p>
@@ -2310,33 +2404,33 @@
         <w:spacing w:before="0" w:after="120" w:line="340" w:lineRule="auto"/>
       </w:pPr>
       <w:r>
-        <w:t xml:space="preserve">P.1 Schedule of all clinical trials (current and past), with phase, indication, enrollment, and current status.</w:t>
-      </w:r>
-    </w:p>
-    <w:p>
-      <w:pPr>
-        <w:pStyle w:val="OABody"/>
-        <w:numPr>
-          <w:ilvl w:val="1"/>
-          <w:numId w:val="1"/>
-        </w:numPr>
-        <w:spacing w:before="0" w:after="120" w:line="340" w:lineRule="auto"/>
-      </w:pPr>
-      <w:r>
-        <w:t xml:space="preserve">P.2 Investigator's Brochures and clinical-trial protocols for active trials.</w:t>
-      </w:r>
-    </w:p>
-    <w:p>
-      <w:pPr>
-        <w:pStyle w:val="OABody"/>
-        <w:numPr>
-          <w:ilvl w:val="1"/>
-          <w:numId w:val="1"/>
-        </w:numPr>
-        <w:spacing w:before="0" w:after="120" w:line="340" w:lineRule="auto"/>
-      </w:pPr>
-      <w:r>
-        <w:t xml:space="preserve">P.3 Serious Adverse Event (SAE) reports filed with the FDA or foreign regulators in the past </w:t>
+        <w:t xml:space="preserve">Q.1 Schedule of all clinical trials (current and past), with phase, indication, enrollment, and current status.</w:t>
+      </w:r>
+    </w:p>
+    <w:p>
+      <w:pPr>
+        <w:pStyle w:val="OABody"/>
+        <w:numPr>
+          <w:ilvl w:val="1"/>
+          <w:numId w:val="1"/>
+        </w:numPr>
+        <w:spacing w:before="0" w:after="120" w:line="340" w:lineRule="auto"/>
+      </w:pPr>
+      <w:r>
+        <w:t xml:space="preserve">Q.2 Investigator's Brochures and clinical-trial protocols for active trials.</w:t>
+      </w:r>
+    </w:p>
+    <w:p>
+      <w:pPr>
+        <w:pStyle w:val="OABody"/>
+        <w:numPr>
+          <w:ilvl w:val="1"/>
+          <w:numId w:val="1"/>
+        </w:numPr>
+        <w:spacing w:before="0" w:after="120" w:line="340" w:lineRule="auto"/>
+      </w:pPr>
+      <w:r>
+        <w:t xml:space="preserve">Q.3 Serious Adverse Event (SAE) reports filed with the FDA or foreign regulators in the past </w:t>
       </w:r>
       <w:r>
         <w:rPr>
@@ -2359,85 +2453,85 @@
         <w:spacing w:before="0" w:after="120" w:line="340" w:lineRule="auto"/>
       </w:pPr>
       <w:r>
-        <w:t xml:space="preserve">P.4 Investigational New Drug (IND), New Drug Application (NDA), Biologics License Application (BLA), and 510(k) / PMA filings, including current status.</w:t>
-      </w:r>
-    </w:p>
-    <w:p>
-      <w:pPr>
-        <w:pStyle w:val="OABody"/>
-        <w:numPr>
-          <w:ilvl w:val="1"/>
-          <w:numId w:val="1"/>
-        </w:numPr>
-        <w:spacing w:before="0" w:after="120" w:line="340" w:lineRule="auto"/>
-      </w:pPr>
-      <w:r>
-        <w:t xml:space="preserve">P.5 All correspondence with the FDA, EMA, or other applicable regulatory authorities, including Form 483 observations and Warning Letters, regardless of date.</w:t>
-      </w:r>
-    </w:p>
-    <w:p>
-      <w:pPr>
-        <w:pStyle w:val="OABody"/>
-        <w:numPr>
-          <w:ilvl w:val="1"/>
-          <w:numId w:val="1"/>
-        </w:numPr>
-        <w:spacing w:before="0" w:after="120" w:line="340" w:lineRule="auto"/>
-      </w:pPr>
-      <w:r>
-        <w:t xml:space="preserve">P.6 Manufacturing-site inspection history, including 21 CFR Part 211 / Part 820 compliance records.</w:t>
-      </w:r>
-    </w:p>
-    <w:p>
-      <w:pPr>
-        <w:pStyle w:val="OABody"/>
-        <w:numPr>
-          <w:ilvl w:val="1"/>
-          <w:numId w:val="1"/>
-        </w:numPr>
-        <w:spacing w:before="0" w:after="120" w:line="340" w:lineRule="auto"/>
-      </w:pPr>
-      <w:r>
-        <w:t xml:space="preserve">P.7 Controlled-substance registrations with the DEA and any state controlled-substance authorities.</w:t>
-      </w:r>
-    </w:p>
-    <w:p>
-      <w:pPr>
-        <w:pStyle w:val="OABody"/>
-        <w:numPr>
-          <w:ilvl w:val="1"/>
-          <w:numId w:val="1"/>
-        </w:numPr>
-        <w:spacing w:before="0" w:after="120" w:line="340" w:lineRule="auto"/>
-      </w:pPr>
-      <w:r>
-        <w:t xml:space="preserve">P.8 CRO (Contract Research Organization) and CMO (Contract Manufacturing Organization) agreements.</w:t>
-      </w:r>
-    </w:p>
-    <w:p>
-      <w:pPr>
-        <w:pStyle w:val="OABody"/>
-        <w:numPr>
-          <w:ilvl w:val="1"/>
-          <w:numId w:val="1"/>
-        </w:numPr>
-        <w:spacing w:before="0" w:after="120" w:line="340" w:lineRule="auto"/>
-      </w:pPr>
-      <w:r>
-        <w:t xml:space="preserve">P.9 R&amp;D collaboration, licensing, and partnering agreements (university, government, or industry).</w:t>
-      </w:r>
-    </w:p>
-    <w:p>
-      <w:pPr>
-        <w:pStyle w:val="OABody"/>
-        <w:numPr>
-          <w:ilvl w:val="1"/>
-          <w:numId w:val="1"/>
-        </w:numPr>
-        <w:spacing w:before="0" w:after="120" w:line="340" w:lineRule="auto"/>
-      </w:pPr>
-      <w:r>
-        <w:t xml:space="preserve">P.10 Any Corporate Integrity Agreement (CIA) with HHS-OIG, DOJ, or other federal authorities.</w:t>
+        <w:t xml:space="preserve">Q.4 Investigational New Drug (IND), New Drug Application (NDA), Biologics License Application (BLA), and 510(k) / PMA filings, including current status.</w:t>
+      </w:r>
+    </w:p>
+    <w:p>
+      <w:pPr>
+        <w:pStyle w:val="OABody"/>
+        <w:numPr>
+          <w:ilvl w:val="1"/>
+          <w:numId w:val="1"/>
+        </w:numPr>
+        <w:spacing w:before="0" w:after="120" w:line="340" w:lineRule="auto"/>
+      </w:pPr>
+      <w:r>
+        <w:t xml:space="preserve">Q.5 All correspondence with the FDA, EMA, or other applicable regulatory authorities, including Form 483 observations and Warning Letters, regardless of date.</w:t>
+      </w:r>
+    </w:p>
+    <w:p>
+      <w:pPr>
+        <w:pStyle w:val="OABody"/>
+        <w:numPr>
+          <w:ilvl w:val="1"/>
+          <w:numId w:val="1"/>
+        </w:numPr>
+        <w:spacing w:before="0" w:after="120" w:line="340" w:lineRule="auto"/>
+      </w:pPr>
+      <w:r>
+        <w:t xml:space="preserve">Q.6 Manufacturing-site inspection history, including 21 CFR Part 211 / Part 820 compliance records.</w:t>
+      </w:r>
+    </w:p>
+    <w:p>
+      <w:pPr>
+        <w:pStyle w:val="OABody"/>
+        <w:numPr>
+          <w:ilvl w:val="1"/>
+          <w:numId w:val="1"/>
+        </w:numPr>
+        <w:spacing w:before="0" w:after="120" w:line="340" w:lineRule="auto"/>
+      </w:pPr>
+      <w:r>
+        <w:t xml:space="preserve">Q.7 Controlled-substance registrations with the DEA and any state controlled-substance authorities.</w:t>
+      </w:r>
+    </w:p>
+    <w:p>
+      <w:pPr>
+        <w:pStyle w:val="OABody"/>
+        <w:numPr>
+          <w:ilvl w:val="1"/>
+          <w:numId w:val="1"/>
+        </w:numPr>
+        <w:spacing w:before="0" w:after="120" w:line="340" w:lineRule="auto"/>
+      </w:pPr>
+      <w:r>
+        <w:t xml:space="preserve">Q.8 CRO (Contract Research Organization) and CMO (Contract Manufacturing Organization) agreements.</w:t>
+      </w:r>
+    </w:p>
+    <w:p>
+      <w:pPr>
+        <w:pStyle w:val="OABody"/>
+        <w:numPr>
+          <w:ilvl w:val="1"/>
+          <w:numId w:val="1"/>
+        </w:numPr>
+        <w:spacing w:before="0" w:after="120" w:line="340" w:lineRule="auto"/>
+      </w:pPr>
+      <w:r>
+        <w:t xml:space="preserve">Q.9 R&amp;D collaboration, licensing, and partnering agreements (university, government, or industry).</w:t>
+      </w:r>
+    </w:p>
+    <w:p>
+      <w:pPr>
+        <w:pStyle w:val="OABody"/>
+        <w:numPr>
+          <w:ilvl w:val="1"/>
+          <w:numId w:val="1"/>
+        </w:numPr>
+        <w:spacing w:before="0" w:after="120" w:line="340" w:lineRule="auto"/>
+      </w:pPr>
+      <w:r>
+        <w:t xml:space="preserve">Q.10 Any Corporate Integrity Agreement (CIA) with HHS-OIG, DOJ, or other federal authorities.</w:t>
       </w:r>
     </w:p>
     <w:p>
@@ -2456,7 +2550,7 @@
           <w:b/>
           <w:bCs/>
         </w:rPr>
-        <w:t xml:space="preserve">Section Q — Healthcare Provider Rider</w:t>
+        <w:t xml:space="preserve">Section R — Healthcare Provider Rider</w:t>
       </w:r>
     </w:p>
     <w:p>
@@ -2482,20 +2576,20 @@
         <w:spacing w:before="0" w:after="120" w:line="340" w:lineRule="auto"/>
       </w:pPr>
       <w:r>
-        <w:t xml:space="preserve">Q.1 Provider licensure for each state of operation, including any prior licensure actions, suspensions, or restrictions.</w:t>
-      </w:r>
-    </w:p>
-    <w:p>
-      <w:pPr>
-        <w:pStyle w:val="OABody"/>
-        <w:numPr>
-          <w:ilvl w:val="1"/>
-          <w:numId w:val="1"/>
-        </w:numPr>
-        <w:spacing w:before="0" w:after="120" w:line="340" w:lineRule="auto"/>
-      </w:pPr>
-      <w:r>
-        <w:t xml:space="preserve">Q.2 Billing and coding compliance audit results for the past </w:t>
+        <w:t xml:space="preserve">R.1 Provider licensure for each state of operation, including any prior licensure actions, suspensions, or restrictions.</w:t>
+      </w:r>
+    </w:p>
+    <w:p>
+      <w:pPr>
+        <w:pStyle w:val="OABody"/>
+        <w:numPr>
+          <w:ilvl w:val="1"/>
+          <w:numId w:val="1"/>
+        </w:numPr>
+        <w:spacing w:before="0" w:after="120" w:line="340" w:lineRule="auto"/>
+      </w:pPr>
+      <w:r>
+        <w:t xml:space="preserve">R.2 Billing and coding compliance audit results for the past </w:t>
       </w:r>
       <w:r>
         <w:rPr>
@@ -2518,7 +2612,7 @@
         <w:spacing w:before="0" w:after="120" w:line="340" w:lineRule="auto"/>
       </w:pPr>
       <w:r>
-        <w:t xml:space="preserve">Q.3 Malpractice claims history for the past </w:t>
+        <w:t xml:space="preserve">R.3 Malpractice claims history for the past </w:t>
       </w:r>
       <w:r>
         <w:rPr>
@@ -2541,59 +2635,59 @@
         <w:spacing w:before="0" w:after="120" w:line="340" w:lineRule="auto"/>
       </w:pPr>
       <w:r>
-        <w:t xml:space="preserve">Q.4 HIPAA breach logs, OCR correspondence, and any corrective-action plans stemming from privacy or security incidents.</w:t>
-      </w:r>
-    </w:p>
-    <w:p>
-      <w:pPr>
-        <w:pStyle w:val="OABody"/>
-        <w:numPr>
-          <w:ilvl w:val="1"/>
-          <w:numId w:val="1"/>
-        </w:numPr>
-        <w:spacing w:before="0" w:after="120" w:line="340" w:lineRule="auto"/>
-      </w:pPr>
-      <w:r>
-        <w:t xml:space="preserve">Q.5 Payer-audit history (Medicare, Medicaid, commercial), recoupment exposure, and current open audits.</w:t>
-      </w:r>
-    </w:p>
-    <w:p>
-      <w:pPr>
-        <w:pStyle w:val="OABody"/>
-        <w:numPr>
-          <w:ilvl w:val="1"/>
-          <w:numId w:val="1"/>
-        </w:numPr>
-        <w:spacing w:before="0" w:after="120" w:line="340" w:lineRule="auto"/>
-      </w:pPr>
-      <w:r>
-        <w:t xml:space="preserve">Q.6 Anti-Kickback Statute, Stark Law, and Physician Payment Sunshine Act compliance documentation, including transfer-of-value reporting.</w:t>
-      </w:r>
-    </w:p>
-    <w:p>
-      <w:pPr>
-        <w:pStyle w:val="OABody"/>
-        <w:numPr>
-          <w:ilvl w:val="1"/>
-          <w:numId w:val="1"/>
-        </w:numPr>
-        <w:spacing w:before="0" w:after="120" w:line="340" w:lineRule="auto"/>
-      </w:pPr>
-      <w:r>
-        <w:t xml:space="preserve">Q.7 Telehealth state-licensure compliance, including any reliance on cross-state compacts (e.g., IMLC).</w:t>
-      </w:r>
-    </w:p>
-    <w:p>
-      <w:pPr>
-        <w:pStyle w:val="OABody"/>
-        <w:numPr>
-          <w:ilvl w:val="1"/>
-          <w:numId w:val="1"/>
-        </w:numPr>
-        <w:spacing w:before="0" w:after="120" w:line="340" w:lineRule="auto"/>
-      </w:pPr>
-      <w:r>
-        <w:t xml:space="preserve">Q.8 Provider compensation arrangements that could implicate fair-market-value or commercial-reasonableness analysis.</w:t>
+        <w:t xml:space="preserve">R.4 HIPAA breach logs, OCR correspondence, and any corrective-action plans stemming from privacy or security incidents.</w:t>
+      </w:r>
+    </w:p>
+    <w:p>
+      <w:pPr>
+        <w:pStyle w:val="OABody"/>
+        <w:numPr>
+          <w:ilvl w:val="1"/>
+          <w:numId w:val="1"/>
+        </w:numPr>
+        <w:spacing w:before="0" w:after="120" w:line="340" w:lineRule="auto"/>
+      </w:pPr>
+      <w:r>
+        <w:t xml:space="preserve">R.5 Payer-audit history (Medicare, Medicaid, commercial), recoupment exposure, and current open audits.</w:t>
+      </w:r>
+    </w:p>
+    <w:p>
+      <w:pPr>
+        <w:pStyle w:val="OABody"/>
+        <w:numPr>
+          <w:ilvl w:val="1"/>
+          <w:numId w:val="1"/>
+        </w:numPr>
+        <w:spacing w:before="0" w:after="120" w:line="340" w:lineRule="auto"/>
+      </w:pPr>
+      <w:r>
+        <w:t xml:space="preserve">R.6 Anti-Kickback Statute, Stark Law, and Physician Payment Sunshine Act compliance documentation, including transfer-of-value reporting.</w:t>
+      </w:r>
+    </w:p>
+    <w:p>
+      <w:pPr>
+        <w:pStyle w:val="OABody"/>
+        <w:numPr>
+          <w:ilvl w:val="1"/>
+          <w:numId w:val="1"/>
+        </w:numPr>
+        <w:spacing w:before="0" w:after="120" w:line="340" w:lineRule="auto"/>
+      </w:pPr>
+      <w:r>
+        <w:t xml:space="preserve">R.7 Telehealth state-licensure compliance, including any reliance on cross-state compacts (e.g., IMLC).</w:t>
+      </w:r>
+    </w:p>
+    <w:p>
+      <w:pPr>
+        <w:pStyle w:val="OABody"/>
+        <w:numPr>
+          <w:ilvl w:val="1"/>
+          <w:numId w:val="1"/>
+        </w:numPr>
+        <w:spacing w:before="0" w:after="120" w:line="340" w:lineRule="auto"/>
+      </w:pPr>
+      <w:r>
+        <w:t xml:space="preserve">R.8 Provider compensation arrangements that could implicate fair-market-value or commercial-reasonableness analysis.</w:t>
       </w:r>
     </w:p>
     <w:p>
@@ -2612,7 +2706,7 @@
           <w:b/>
           <w:bCs/>
         </w:rPr>
-        <w:t xml:space="preserve">Section R — Cross-Border / Trade Compliance Rider</w:t>
+        <w:t xml:space="preserve">Section S — Cross-Border / Trade Compliance Rider</w:t>
       </w:r>
     </w:p>
     <w:p>
@@ -2638,98 +2732,98 @@
         <w:spacing w:before="0" w:after="120" w:line="340" w:lineRule="auto"/>
       </w:pPr>
       <w:r>
-        <w:t xml:space="preserve">R.1 Foreign-subsidiary and branch documentation, including formation documents, governance, and intercompany agreements.</w:t>
-      </w:r>
-    </w:p>
-    <w:p>
-      <w:pPr>
-        <w:pStyle w:val="OABody"/>
-        <w:numPr>
-          <w:ilvl w:val="1"/>
-          <w:numId w:val="1"/>
-        </w:numPr>
-        <w:spacing w:before="0" w:after="120" w:line="340" w:lineRule="auto"/>
-      </w:pPr>
-      <w:r>
-        <w:t xml:space="preserve">R.2 Sanctions / OFAC screening procedures, screening tool documentation, and any historical hits or escalations.</w:t>
-      </w:r>
-    </w:p>
-    <w:p>
-      <w:pPr>
-        <w:pStyle w:val="OABody"/>
-        <w:numPr>
-          <w:ilvl w:val="1"/>
-          <w:numId w:val="1"/>
-        </w:numPr>
-        <w:spacing w:before="0" w:after="120" w:line="340" w:lineRule="auto"/>
-      </w:pPr>
-      <w:r>
-        <w:t xml:space="preserve">R.3 Export-control classifications (ECCN, USML) for material technologies and products, plus any export licenses or commodity classification rulings.</w:t>
-      </w:r>
-    </w:p>
-    <w:p>
-      <w:pPr>
-        <w:pStyle w:val="OABody"/>
-        <w:numPr>
-          <w:ilvl w:val="1"/>
-          <w:numId w:val="1"/>
-        </w:numPr>
-        <w:spacing w:before="0" w:after="120" w:line="340" w:lineRule="auto"/>
-      </w:pPr>
-      <w:r>
-        <w:t xml:space="preserve">R.4 AML / KYC program documentation (where applicable to the target's industry), including written policies and procedures, training records, regulator examination findings, and non-privileged audit/correspondence files. Do not produce any SARs or materials that would reveal a SAR's existence — FinCEN's SAR confidentiality rules bar disclosure to counterparties under whichever subpart applies to the target's institution type (e.g., 31 CFR 1020.320(e) for banks; 1023.320(e) for broker-dealers; 1022.320(e) for MSBs; 1021.320(e) for casinos; 1024.320(e) for mutual funds; 1025.320(e) for insurance companies; 1029.320(e) for loan/finance companies).</w:t>
-      </w:r>
-    </w:p>
-    <w:p>
-      <w:pPr>
-        <w:pStyle w:val="OABody"/>
-        <w:numPr>
-          <w:ilvl w:val="1"/>
-          <w:numId w:val="1"/>
-        </w:numPr>
-        <w:spacing w:before="0" w:after="120" w:line="340" w:lineRule="auto"/>
-      </w:pPr>
-      <w:r>
-        <w:t xml:space="preserve">R.5 FCPA compliance program documentation, including risk assessments, training records, third-party-intermediary diligence, and any prior internal investigations or third-party allegations.</w:t>
-      </w:r>
-    </w:p>
-    <w:p>
-      <w:pPr>
-        <w:pStyle w:val="OABody"/>
-        <w:numPr>
-          <w:ilvl w:val="1"/>
-          <w:numId w:val="1"/>
-        </w:numPr>
-        <w:spacing w:before="0" w:after="120" w:line="340" w:lineRule="auto"/>
-      </w:pPr>
-      <w:r>
-        <w:t xml:space="preserve">R.6 Government-customer relationships (federal, state, local, or foreign), including contract terms with flow-down compliance obligations and any audit history. Include any GSA Schedule contracts, FAR-flowdown analysis, and SBA representations.</w:t>
-      </w:r>
-    </w:p>
-    <w:p>
-      <w:pPr>
-        <w:pStyle w:val="OABody"/>
-        <w:numPr>
-          <w:ilvl w:val="1"/>
-          <w:numId w:val="1"/>
-        </w:numPr>
-        <w:spacing w:before="0" w:after="120" w:line="340" w:lineRule="auto"/>
-      </w:pPr>
-      <w:r>
-        <w:t xml:space="preserve">R.7 Operations or sales in higher-risk corruption-index jurisdictions; specify each country of operation, sale, or employee presence.</w:t>
-      </w:r>
-    </w:p>
-    <w:p>
-      <w:pPr>
-        <w:pStyle w:val="OABody"/>
-        <w:numPr>
-          <w:ilvl w:val="1"/>
-          <w:numId w:val="1"/>
-        </w:numPr>
-        <w:spacing w:before="0" w:after="120" w:line="340" w:lineRule="auto"/>
-      </w:pPr>
-      <w:r>
-        <w:t xml:space="preserve">R.8 Foreign-investment-screening filings (CFIUS, foreign FDI regimes), including any prior CFIUS reviews of the target or its subsidiaries.</w:t>
+        <w:t xml:space="preserve">S.1 Foreign-subsidiary and branch documentation, including formation documents, governance, and intercompany agreements.</w:t>
+      </w:r>
+    </w:p>
+    <w:p>
+      <w:pPr>
+        <w:pStyle w:val="OABody"/>
+        <w:numPr>
+          <w:ilvl w:val="1"/>
+          <w:numId w:val="1"/>
+        </w:numPr>
+        <w:spacing w:before="0" w:after="120" w:line="340" w:lineRule="auto"/>
+      </w:pPr>
+      <w:r>
+        <w:t xml:space="preserve">S.2 Sanctions / OFAC screening procedures, screening tool documentation, and any historical hits or escalations.</w:t>
+      </w:r>
+    </w:p>
+    <w:p>
+      <w:pPr>
+        <w:pStyle w:val="OABody"/>
+        <w:numPr>
+          <w:ilvl w:val="1"/>
+          <w:numId w:val="1"/>
+        </w:numPr>
+        <w:spacing w:before="0" w:after="120" w:line="340" w:lineRule="auto"/>
+      </w:pPr>
+      <w:r>
+        <w:t xml:space="preserve">S.3 Export-control classifications (ECCN, USML) for material technologies and products, plus any export licenses or commodity classification rulings.</w:t>
+      </w:r>
+    </w:p>
+    <w:p>
+      <w:pPr>
+        <w:pStyle w:val="OABody"/>
+        <w:numPr>
+          <w:ilvl w:val="1"/>
+          <w:numId w:val="1"/>
+        </w:numPr>
+        <w:spacing w:before="0" w:after="120" w:line="340" w:lineRule="auto"/>
+      </w:pPr>
+      <w:r>
+        <w:t xml:space="preserve">S.4 AML / KYC program documentation (where applicable to the target's industry), including written policies and procedures, training records, regulator examination findings, and non-privileged audit/correspondence files. Do not produce any SARs or materials that would reveal a SAR's existence — FinCEN's SAR confidentiality rules bar disclosure to counterparties under whichever subpart applies to the target's institution type (e.g., 31 CFR 1020.320(e) for banks; 1023.320(e) for broker-dealers; 1022.320(e) for MSBs; 1021.320(e) for casinos; 1024.320(e) for mutual funds; 1025.320(e) for insurance companies; 1029.320(e) for loan/finance companies).</w:t>
+      </w:r>
+    </w:p>
+    <w:p>
+      <w:pPr>
+        <w:pStyle w:val="OABody"/>
+        <w:numPr>
+          <w:ilvl w:val="1"/>
+          <w:numId w:val="1"/>
+        </w:numPr>
+        <w:spacing w:before="0" w:after="120" w:line="340" w:lineRule="auto"/>
+      </w:pPr>
+      <w:r>
+        <w:t xml:space="preserve">S.5 FCPA compliance program documentation, including risk assessments, training records, third-party-intermediary diligence, and any prior internal investigations or third-party allegations.</w:t>
+      </w:r>
+    </w:p>
+    <w:p>
+      <w:pPr>
+        <w:pStyle w:val="OABody"/>
+        <w:numPr>
+          <w:ilvl w:val="1"/>
+          <w:numId w:val="1"/>
+        </w:numPr>
+        <w:spacing w:before="0" w:after="120" w:line="340" w:lineRule="auto"/>
+      </w:pPr>
+      <w:r>
+        <w:t xml:space="preserve">S.6 Government-customer relationships (federal, state, local, or foreign), including contract terms with flow-down compliance obligations and any audit history. Include any GSA Schedule contracts, FAR-flowdown analysis, and SBA representations.</w:t>
+      </w:r>
+    </w:p>
+    <w:p>
+      <w:pPr>
+        <w:pStyle w:val="OABody"/>
+        <w:numPr>
+          <w:ilvl w:val="1"/>
+          <w:numId w:val="1"/>
+        </w:numPr>
+        <w:spacing w:before="0" w:after="120" w:line="340" w:lineRule="auto"/>
+      </w:pPr>
+      <w:r>
+        <w:t xml:space="preserve">S.7 Operations or sales in higher-risk corruption-index jurisdictions; specify each country of operation, sale, or employee presence.</w:t>
+      </w:r>
+    </w:p>
+    <w:p>
+      <w:pPr>
+        <w:pStyle w:val="OABody"/>
+        <w:numPr>
+          <w:ilvl w:val="1"/>
+          <w:numId w:val="1"/>
+        </w:numPr>
+        <w:spacing w:before="0" w:after="120" w:line="340" w:lineRule="auto"/>
+      </w:pPr>
+      <w:r>
+        <w:t xml:space="preserve">S.8 Foreign-investment-screening filings (CFIUS, foreign FDI regimes), including any prior CFIUS reviews of the target or its subsidiaries.</w:t>
       </w:r>
     </w:p>
     <w:sectPr>

</xml_diff>